<commit_message>
Recuperar por navegador lo que el editor no sirve a un robot, y un tercer caso de idioma
El navegador pasa la verificación de Cloudflare que bloquea a las peticiones
automáticas, así que el texto íntegro de los artículos abiertos sí se puede
leer. Recuperados EST-181 (Viruses, 65 202 caracteres) y EST-122 (BMJ Open,
50 274), ambos con Resultados y Discusión completos.

Y un hallazgo que solo aparece leyendo el artículo: EST-123 tiene el resumen en
inglés y el cuerpo en ruso -- la propia revista lo rotula "Full Text (RUSSIAN)".
Es el tercer caso tras EST-067 y EST-079. Excluido con la prueba en el motivo.

El recuento de texto completo ya no cuenta solo ficheros: un artículo servido en
HTML por el editor es el mismo dato para quien va a extraer. 65 de 124 (52,4 %).

Corpus: 184 estudios, 124 extraíbles, 23 comparativos, 16 ECA.

Co-Authored-By: Claude Opus 5 <noreply@anthropic.com>
</commit_message>
<xml_diff>
--- a/verificables revisión sistemática/00_INDICE.docx
+++ b/verificables revisión sistemática/00_INDICE.docx
@@ -441,7 +441,7 @@
               <w:rPr>
                 <w:sz w:val="18"/>
               </w:rPr>
-              <w:t>S5_listado_185_estudios.csv</w:t>
+              <w:t>S5_listado_184_estudios.csv</w:t>
             </w:r>
           </w:p>
         </w:tc>
@@ -965,7 +965,7 @@
               <w:rPr>
                 <w:sz w:val="18"/>
               </w:rPr>
-              <w:t>PARCIAL — 63 de 125 (50.4 %)</w:t>
+              <w:t>PARCIAL — 65 de 124 (52.4 %)</w:t>
             </w:r>
           </w:p>
         </w:tc>

</xml_diff>